<commit_message>
Add a data-validation gate and subgroup fairness check to the quality gate
- New data gate (src/credit_risk/validation.py, scripts/validate_data.py) runs
  before training and rejects a batch with a bad schema, >10% missing in any
  column, too few rows, a non-binary target or out-of-range values. Wired into
  CI as its own step and into run_gate as the first gate.
- The model gate now also reports the subgroup false-negative-rate gap by
  Income_Bracket on every run, with an optional gate.max_fairness_gap to turn
  the report into a hard check (src/credit_risk/fairness.py).
- Config gains data_validation and gate.max_fairness_gap sections (Pydantic).
- 7 new unit tests for the data gate (28 passing total).

Co-Authored-By: Claude Opus 4.8 <noreply@anthropic.com>
</commit_message>
<xml_diff>
--- a/report/Project1_Credit_Risk_Report.docx
+++ b/report/Project1_Credit_Risk_Report.docx
@@ -195,7 +195,7 @@
                 <w:color w:val="6A1B9A"/>
                 <w:sz w:val="28"/>
               </w:rPr>
-              <w:t>21 / 21</w:t>
+              <w:t>28 / 28</w:t>
             </w:r>
           </w:p>
           <w:p>
@@ -5549,7 +5549,35 @@
           <w:i w:val="0"/>
           <w:sz w:val="21"/>
         </w:rPr>
-        <w:t>A GitHub Actions workflow runs on every pull request into main. It installs dependencies, restores the data with dvc pull, runs pytest, trains with the CI configuration, compares the best model PR-AUC to the baseline, and blocks the merge if a test fails or the model is worse. It writes a short Markdown summary a reviewer can read without opening logs.</w:t>
+        <w:t>A GitHub Actions workflow runs on every pull request into main. It installs dependencies, restores the data with dvc pull, runs the 28 unit tests, then applies two gates in order and blocks the merge if either fails. It writes a short Markdown summary a reviewer can read without opening logs.</w:t>
+      </w:r>
+    </w:p>
+    <w:p>
+      <w:pPr>
+        <w:spacing w:before="180" w:after="60"/>
+      </w:pPr>
+      <w:r>
+        <w:rPr>
+          <w:rFonts w:ascii="Calibri" w:hAnsi="Calibri"/>
+          <w:b/>
+          <w:color w:val="8E3CC4"/>
+          <w:sz w:val="24"/>
+        </w:rPr>
+        <w:t>Two gates: data then model</w:t>
+      </w:r>
+    </w:p>
+    <w:p>
+      <w:pPr>
+        <w:spacing w:after="120" w:before="0"/>
+      </w:pPr>
+      <w:r>
+        <w:rPr>
+          <w:rFonts w:ascii="Calibri" w:hAnsi="Calibri"/>
+          <w:b w:val="0"/>
+          <w:i w:val="0"/>
+          <w:sz w:val="21"/>
+        </w:rPr>
+        <w:t>A data gate (scripts/validate_data.py) runs first and rejects a batch whose schema is wrong, whose missing-value share in any column exceeds 10 percent, or whose values fall outside sane ranges (for example an age above 100). Only if the data passes does the model gate train and compare to the baseline. This mirrors a real retraining pipeline, where bad data is stopped before it can produce a bad model. The gate summary also reports the subgroup false-negative-rate gap on every run, and a configurable max_fairness_gap can turn that report into a hard check.</w:t>
       </w:r>
     </w:p>
     <w:p>

</xml_diff>